<commit_message>
docs: polish literature dossier formatting
</commit_message>
<xml_diff>
--- a/docs/references/particleml-literature-reference-dossier.docx
+++ b/docs/references/particleml-literature-reference-dossier.docx
@@ -1070,11 +1070,6 @@
       </w:r>
     </w:p>
     <w:p>
-      <w:r>
-        <w:br w:type="page"/>
-      </w:r>
-    </w:p>
-    <w:p>
       <w:pPr>
         <w:pStyle w:val="Heading1"/>
       </w:pPr>
@@ -6478,7 +6473,7 @@
           <w:rFonts w:ascii="Calibri" w:hAnsi="Calibri"/>
           <w:sz w:val="20"/>
         </w:rPr>
-        <w:t>[6] Oz Amram, Luca Anzalone, Joschka Birk, et al.. "Aspen Open Jets: Unlocking LHC Data for Foundation Models in Particle Physics." In: Machine Learning: Science and Technology 6.3, 030601 (2025). doi: 10.1088/2632-2153/ade58f. arXiv: 2412.10504. url: https://doi.org/10.1088/2632-2153/ade58f.</w:t>
+        <w:t>[6] Oz Amram, Luca Anzalone, Joschka Birk, et al. "Aspen Open Jets: Unlocking LHC Data for Foundation Models in Particle Physics." In: Machine Learning: Science and Technology 6.3, 030601 (2025). doi: 10.1088/2632-2153/ade58f. arXiv: 2412.10504. url: https://doi.org/10.1088/2632-2153/ade58f.</w:t>
       </w:r>
     </w:p>
     <w:p>
@@ -6491,7 +6486,7 @@
           <w:rFonts w:ascii="Calibri" w:hAnsi="Calibri"/>
           <w:sz w:val="20"/>
         </w:rPr>
-        <w:t>[7] Huilin Qu, Congqiao Li, and Sitian Qian. "Particle Transformer for Jet Tagging." In: Proceedings of the 39th International Conference on Machine Learning, PMLR 162 162, 18281-18292 (2022). arXiv: 2202.03772. url: https://proceedings.mlr.press/v162/qu22b.html.</w:t>
+        <w:t>[7] Huilin Qu, Congqiao Li, and Sitian Qian. "Particle Transformer for Jet Tagging." In: Proceedings of the 39th International Conference on Machine Learning, PMLR 162 18281-18292 (2022). arXiv: 2202.03772. url: https://proceedings.mlr.press/v162/qu22b.html.</w:t>
       </w:r>
     </w:p>
     <w:p>
@@ -6530,7 +6525,7 @@
           <w:rFonts w:ascii="Calibri" w:hAnsi="Calibri"/>
           <w:sz w:val="20"/>
         </w:rPr>
-        <w:t>[10] Gregor Kasieczka, Tilman Plehn, Anja Butter, Kyle Cranmer, Dipsikha Debnath, et al.. "The Machine Learning Landscape of Top Taggers." In: SciPost Physics 7.1, 014 (2019). doi: 10.21468/SciPostPhys.7.1.014. arXiv: 1902.09914. url: https://doi.org/10.21468/SciPostPhys.7.1.014.</w:t>
+        <w:t>[10] Gregor Kasieczka, Tilman Plehn, Anja Butter, Kyle Cranmer, Dipsikha Debnath, et al. "The Machine Learning Landscape of Top Taggers." In: SciPost Physics 7.1, 014 (2019). doi: 10.21468/SciPostPhys.7.1.014. arXiv: 1902.09914. url: https://doi.org/10.21468/SciPostPhys.7.1.014.</w:t>
       </w:r>
     </w:p>
     <w:p>
@@ -6569,7 +6564,7 @@
           <w:rFonts w:ascii="Calibri" w:hAnsi="Calibri"/>
           <w:sz w:val="20"/>
         </w:rPr>
-        <w:t>[13] Juho Lee, Yoonho Lee, Jungtaek Kim, Adam R. Kosiorek, Seungjin Choi, and Yee Whye Teh. "Set Transformer: A Framework for Attention-Based Permutation-Invariant Neural Networks." In: Proceedings of the 36th International Conference on Machine Learning, PMLR 97 97, 3744-3753 (2019). arXiv: 1810.00825. url: https://proceedings.mlr.press/v97/lee19d.html.</w:t>
+        <w:t>[13] Juho Lee, Yoonho Lee, Jungtaek Kim, Adam R. Kosiorek, Seungjin Choi, and Yee Whye Teh. "Set Transformer: A Framework for Attention-Based Permutation-Invariant Neural Networks." In: Proceedings of the 36th International Conference on Machine Learning, PMLR 97 3744-3753 (2019). arXiv: 1810.00825. url: https://proceedings.mlr.press/v97/lee19d.html.</w:t>
       </w:r>
     </w:p>
     <w:p>
@@ -6608,7 +6603,7 @@
           <w:rFonts w:ascii="Calibri" w:hAnsi="Calibri"/>
           <w:sz w:val="20"/>
         </w:rPr>
-        <w:t>[16] Shiqi Gong, Qi Meng, Jue Zhang, et al.. "An Efficient Lorentz Equivariant Graph Neural Network for Jet Tagging." In: Journal of High Energy Physics 2022.7, 030 (2022). doi: 10.1007/JHEP07(2022)030. arXiv: 2201.08187. url: https://doi.org/10.1007/JHEP07(2022)030.</w:t>
+        <w:t>[16] Shiqi Gong, Qi Meng, Jue Zhang, et al. "An Efficient Lorentz Equivariant Graph Neural Network for Jet Tagging." In: Journal of High Energy Physics 2022.7, 030 (2022). doi: 10.1007/JHEP07(2022)030. arXiv: 2201.08187. url: https://doi.org/10.1007/JHEP07(2022)030.</w:t>
       </w:r>
     </w:p>
     <w:p>
@@ -6686,7 +6681,7 @@
           <w:rFonts w:ascii="Calibri" w:hAnsi="Calibri"/>
           <w:sz w:val="20"/>
         </w:rPr>
-        <w:t>[22] Rishi Bommasani, Drew A. Hudson, Ehsan Adeli, et al.. "On the Opportunities and Risks of Foundation Models." In: arXiv preprint (2021). arXiv: 2108.07258. url: https://arxiv.org/abs/2108.07258.</w:t>
+        <w:t>[22] Rishi Bommasani, Drew A. Hudson, Ehsan Adeli, et al. "On the Opportunities and Risks of Foundation Models." In: arXiv preprint (2021). arXiv: 2108.07258. url: https://arxiv.org/abs/2108.07258.</w:t>
       </w:r>
     </w:p>
     <w:p>
@@ -6699,7 +6694,7 @@
           <w:rFonts w:ascii="Calibri" w:hAnsi="Calibri"/>
           <w:sz w:val="20"/>
         </w:rPr>
-        <w:t>[23] Alexander Radovic, Mike Williams, David Rousseau, Michael Kagan, et al.. "Machine Learning at the Energy and Intensity Frontiers of Particle Physics." In: Nature 560.7716, 41-48 (2018). doi: 10.1038/s41586-018-0361-2. arXiv: 1807.02876. url: https://doi.org/10.1038/s41586-018-0361-2.</w:t>
+        <w:t>[23] Alexander Radovic, Mike Williams, David Rousseau, Michael Kagan, et al. "Machine Learning at the Energy and Intensity Frontiers of Particle Physics." In: Nature 560.7716, 41-48 (2018). doi: 10.1038/s41586-018-0361-2. arXiv: 1807.02876. url: https://doi.org/10.1038/s41586-018-0361-2.</w:t>
       </w:r>
     </w:p>
     <w:p>
@@ -6764,7 +6759,7 @@
           <w:rFonts w:ascii="Calibri" w:hAnsi="Calibri"/>
           <w:sz w:val="20"/>
         </w:rPr>
-        <w:t>[28] Joelle Pineau, Philippe Vincent-Lamarre, Koustuv Sinha, et al.. "Improving Reproducibility in Machine Learning Research: A Report from the NeurIPS 2019 Reproducibility Program." In: Journal of Machine Learning Research 22.164, 1-20 (2021). url: https://jmlr.org/papers/v22/20-303.html.</w:t>
+        <w:t>[28] Joelle Pineau, Philippe Vincent-Lamarre, Koustuv Sinha, et al. "Improving Reproducibility in Machine Learning Research: A Report from the NeurIPS 2019 Reproducibility Program." In: Journal of Machine Learning Research 22.164, 1-20 (2021). url: https://jmlr.org/papers/v22/20-303.html.</w:t>
       </w:r>
     </w:p>
     <w:p>
@@ -6816,7 +6811,7 @@
           <w:rFonts w:ascii="Calibri" w:hAnsi="Calibri"/>
           <w:sz w:val="20"/>
         </w:rPr>
-        <w:t>[32] Breno Orzari, Nadezda Chernyavskaya, Raphael Cobe, Javier Duarte, Jefferson Fialho, et al.. "LHC Hadronic Jet Generation Using Convolutional Variational Autoencoders with Normalizing Flows." In: Machine Learning: Science and Technology 4.4, 045023 (2023). doi: 10.1088/2632-2153/ad04ea. arXiv: 2310.13138. url: https://doi.org/10.1088/2632-2153/ad04ea.</w:t>
+        <w:t>[32] Breno Orzari, Nadezda Chernyavskaya, Raphael Cobe, Javier Duarte, Jefferson Fialho, et al. "LHC Hadronic Jet Generation Using Convolutional Variational Autoencoders with Normalizing Flows." In: Machine Learning: Science and Technology 4.4, 045023 (2023). doi: 10.1088/2632-2153/ad04ea. arXiv: 2310.13138. url: https://doi.org/10.1088/2632-2153/ad04ea.</w:t>
       </w:r>
     </w:p>
     <w:p>
@@ -6842,7 +6837,7 @@
           <w:rFonts w:ascii="Calibri" w:hAnsi="Calibri"/>
           <w:sz w:val="20"/>
         </w:rPr>
-        <w:t>[34] Gregor Kasieczka, Benjamin Nachman, David Shih, Oz Amram, Anders Andreassen, et al.. "The LHC Olympics 2020: A Community Challenge for Anomaly Detection in High Energy Physics." In: Reports on Progress in Physics 84.12, 124201 (2021). doi: 10.1088/1361-6633/ac36b9. arXiv: 2101.08320. url: https://doi.org/10.1088/1361-6633/ac36b9.</w:t>
+        <w:t>[34] Gregor Kasieczka, Benjamin Nachman, David Shih, Oz Amram, Anders Andreassen, et al. "The LHC Olympics 2020: A Community Challenge for Anomaly Detection in High Energy Physics." In: Reports on Progress in Physics 84.12, 124201 (2021). doi: 10.1088/1361-6633/ac36b9. arXiv: 2101.08320. url: https://doi.org/10.1088/1361-6633/ac36b9.</w:t>
       </w:r>
     </w:p>
     <w:p>

</xml_diff>